<commit_message>
align manuscript with fig7 internal validation and finalize table5/s8 formatting
</commit_message>
<xml_diff>
--- a/docs/manuscript/Figure_Names_and_Legends_Submission.docx
+++ b/docs/manuscript/Figure_Names_and_Legends_Submission.docx
@@ -299,7 +299,7 @@
           <w:b/>
           <w:bCs/>
         </w:rPr>
-        <w:t xml:space="preserve">Figure 7. Continuous-risk clinical translation from effect size to event distribution.</w:t>
+        <w:t xml:space="preserve">Figure 7. Robust prognostic validation of the M12 model across internal and external cohorts.</w:t>
       </w:r>
       <w:r>
         <w:br/>
@@ -406,7 +406,7 @@
           <w:b/>
           <w:bCs/>
         </w:rPr>
-        <w:t xml:space="preserve">Supplementary Figure S5. External Kaplan-Meier validation in independent cohorts.</w:t>
+        <w:t xml:space="preserve">Supplementary Figure S5. Diagnostic performance of the M12 model in the TCGA training cohort.</w:t>
       </w:r>
       <w:r>
         <w:br/>

</xml_diff>